<commit_message>
Add mu-plugin readiness banner, update landing page and assets
Blocks plugin creation until the mu-plugin loader is copied and shows a status notice in the admin views instead of the old bare notice; also refreshes landing page assets and rebuilds pack/rtl archives.

Co-Authored-By: Claude Sonnet 5 <noreply@anthropic.com>
</commit_message>
<xml_diff>
--- a/rtl/help.docx
+++ b/rtl/help.docx
@@ -2351,6 +2351,57 @@
         </w:rPr>
         <w:t xml:space="preserve"> </w:t>
       </w:r>
+      <w:r>
+        <w:rPr>
+          <w:rFonts w:ascii="PeydaWeb" w:hAnsi="PeydaWeb" w:cs="PeydaWeb"/>
+          <w:b/>
+          <w:bCs/>
+          <w:rtl/>
+        </w:rPr>
+        <w:t>صفحه استودیو باز نمی‌شود یا خطای</w:t>
+      </w:r>
+      <w:r>
+        <w:rPr>
+          <w:rFonts w:ascii="PeydaWeb" w:hAnsi="PeydaWeb" w:cs="PeydaWeb"/>
+          <w:b/>
+          <w:bCs/>
+        </w:rPr>
+        <w:t xml:space="preserve"> «</w:t>
+      </w:r>
+      <w:r>
+        <w:rPr>
+          <w:rFonts w:ascii="PeydaWeb" w:hAnsi="PeydaWeb" w:cs="PeydaWeb" w:hint="cs"/>
+          <w:b/>
+          <w:bCs/>
+          <w:rtl/>
+        </w:rPr>
+        <w:t xml:space="preserve"> 404 </w:t>
+      </w:r>
+      <w:r>
+        <w:rPr>
+          <w:rFonts w:ascii="PeydaWeb" w:hAnsi="PeydaWeb" w:cs="PeydaWeb"/>
+          <w:b/>
+          <w:bCs/>
+        </w:rPr>
+        <w:t xml:space="preserve">Route not found» </w:t>
+      </w:r>
+      <w:r>
+        <w:rPr>
+          <w:rFonts w:ascii="PeydaWeb" w:hAnsi="PeydaWeb" w:cs="PeydaWeb"/>
+          <w:b/>
+          <w:bCs/>
+          <w:rtl/>
+        </w:rPr>
+        <w:t>می‌دهد</w:t>
+      </w:r>
+      <w:r>
+        <w:rPr>
+          <w:rFonts w:ascii="PeydaWeb" w:hAnsi="PeydaWeb" w:cs="PeydaWeb"/>
+          <w:b/>
+          <w:bCs/>
+        </w:rPr>
+        <w:t>.</w:t>
+      </w:r>
     </w:p>
     <w:p>
       <w:pPr>
@@ -2363,11 +2414,720 @@
       <w:r>
         <w:rPr>
           <w:rFonts w:ascii="PeydaWeb" w:hAnsi="PeydaWeb" w:cs="PeydaWeb"/>
-          <w:b/>
-          <w:bCs/>
-          <w:rtl/>
-        </w:rPr>
-        <w:t>صفحه استودیو باز نمی‌شود یا خطای «Route not found» می‌دهد.</w:t>
+          <w:rtl/>
+        </w:rPr>
+        <w:t xml:space="preserve">افزونه هنگام فعال شدن، یک فایل بارگذار (لودر) را خودکار در پوشه </w:t>
+      </w:r>
+      <w:r>
+        <w:rPr>
+          <w:rFonts w:ascii="PeydaWeb" w:hAnsi="PeydaWeb" w:cs="PeydaWeb"/>
+        </w:rPr>
+        <w:t xml:space="preserve">wp-content/mu-plugins/ </w:t>
+      </w:r>
+      <w:r>
+        <w:rPr>
+          <w:rFonts w:ascii="PeydaWeb" w:hAnsi="PeydaWeb" w:cs="PeydaWeb"/>
+          <w:rtl/>
+        </w:rPr>
+        <w:t>می‌سازد. تا وقتی این فایل آنجا نباشد، استودیو کار نمی‌کند و همین خطا را می‌بینید. معمولاً علت این است که هاست اجازه‌ی نوشتن در آن پوشه را نداده — در این حالت بالای پیشخوان یک پیام قرمز با همین توضیح می‌بینید</w:t>
+      </w:r>
+      <w:r>
+        <w:rPr>
+          <w:rFonts w:ascii="PeydaWeb" w:hAnsi="PeydaWeb" w:cs="PeydaWeb"/>
+        </w:rPr>
+        <w:t>.</w:t>
+      </w:r>
+    </w:p>
+    <w:p>
+      <w:pPr>
+        <w:bidi/>
+        <w:spacing w:after="120"/>
+        <w:rPr>
+          <w:rFonts w:ascii="PeydaWeb" w:hAnsi="PeydaWeb" w:cs="PeydaWeb"/>
+        </w:rPr>
+      </w:pPr>
+      <w:r>
+        <w:rPr>
+          <w:rFonts w:ascii="PeydaWeb" w:hAnsi="PeydaWeb" w:cs="PeydaWeb"/>
+          <w:rtl/>
+        </w:rPr>
+        <w:t>راه حل خودکار (اول این را امتحان کنید)</w:t>
+      </w:r>
+      <w:r>
+        <w:rPr>
+          <w:rFonts w:ascii="PeydaWeb" w:hAnsi="PeydaWeb" w:cs="PeydaWeb"/>
+        </w:rPr>
+        <w:t xml:space="preserve">: </w:t>
+      </w:r>
+      <w:r>
+        <w:rPr>
+          <w:rFonts w:ascii="PeydaWeb" w:hAnsi="PeydaWeb" w:cs="PeydaWeb"/>
+          <w:rtl/>
+        </w:rPr>
+        <w:t xml:space="preserve">دسترسی نوشتن پوشه </w:t>
+      </w:r>
+      <w:r>
+        <w:rPr>
+          <w:rFonts w:ascii="PeydaWeb" w:hAnsi="PeydaWeb" w:cs="PeydaWeb"/>
+        </w:rPr>
+        <w:t xml:space="preserve">wp-content </w:t>
+      </w:r>
+      <w:r>
+        <w:rPr>
+          <w:rFonts w:ascii="PeydaWeb" w:hAnsi="PeydaWeb" w:cs="PeydaWeb"/>
+          <w:rtl/>
+        </w:rPr>
+        <w:t>را (</w:t>
+      </w:r>
+      <w:r>
+        <w:rPr>
+          <w:rFonts w:ascii="PeydaWeb" w:hAnsi="PeydaWeb" w:cs="PeydaWeb"/>
+          <w:rtl/>
+          <w:lang w:bidi="fa-IR"/>
+        </w:rPr>
+        <w:t>۷۵۵</w:t>
+      </w:r>
+      <w:r>
+        <w:rPr>
+          <w:rFonts w:ascii="PeydaWeb" w:hAnsi="PeydaWeb" w:cs="PeydaWeb"/>
+          <w:rtl/>
+        </w:rPr>
+        <w:t xml:space="preserve"> یا </w:t>
+      </w:r>
+      <w:r>
+        <w:rPr>
+          <w:rFonts w:ascii="PeydaWeb" w:hAnsi="PeydaWeb" w:cs="PeydaWeb"/>
+          <w:rtl/>
+          <w:lang w:bidi="fa-IR"/>
+        </w:rPr>
+        <w:t xml:space="preserve">۷۷۵) </w:t>
+      </w:r>
+      <w:r>
+        <w:rPr>
+          <w:rFonts w:ascii="PeydaWeb" w:hAnsi="PeydaWeb" w:cs="PeydaWeb"/>
+          <w:rtl/>
+        </w:rPr>
+        <w:t>در هاست خود اصلاح کنید و یک‌بار صفحه پیشخوان را تازه‌سازی (رفرش) کنید. فایل به‌طور خودکار ساخته می‌شود و پیام قرمز از بین می‌رود</w:t>
+      </w:r>
+      <w:r>
+        <w:rPr>
+          <w:rFonts w:ascii="PeydaWeb" w:hAnsi="PeydaWeb" w:cs="PeydaWeb"/>
+        </w:rPr>
+        <w:t>.</w:t>
+      </w:r>
+    </w:p>
+    <w:p>
+      <w:pPr>
+        <w:bidi/>
+        <w:spacing w:after="120"/>
+        <w:rPr>
+          <w:rFonts w:ascii="PeydaWeb" w:hAnsi="PeydaWeb" w:cs="PeydaWeb"/>
+        </w:rPr>
+      </w:pPr>
+      <w:r>
+        <w:rPr>
+          <w:rFonts w:ascii="PeydaWeb" w:hAnsi="PeydaWeb" w:cs="PeydaWeb"/>
+          <w:rtl/>
+        </w:rPr>
+        <w:t>راه حل دستی</w:t>
+      </w:r>
+      <w:r>
+        <w:rPr>
+          <w:rFonts w:ascii="PeydaWeb" w:hAnsi="PeydaWeb" w:cs="PeydaWeb"/>
+        </w:rPr>
+        <w:t xml:space="preserve"> (</w:t>
+      </w:r>
+      <w:r>
+        <w:rPr>
+          <w:rFonts w:ascii="PeydaWeb" w:hAnsi="PeydaWeb" w:cs="PeydaWeb"/>
+          <w:rtl/>
+        </w:rPr>
+        <w:t>اگر پیام قرمز باقی ماند یا به فایل‌منیجر</w:t>
+      </w:r>
+      <w:r>
+        <w:rPr>
+          <w:rFonts w:ascii="PeydaWeb" w:hAnsi="PeydaWeb" w:cs="PeydaWeb"/>
+        </w:rPr>
+        <w:t xml:space="preserve">/FTP </w:t>
+      </w:r>
+      <w:r>
+        <w:rPr>
+          <w:rFonts w:ascii="PeydaWeb" w:hAnsi="PeydaWeb" w:cs="PeydaWeb"/>
+          <w:rtl/>
+        </w:rPr>
+        <w:t>هاست دسترسی دارید</w:t>
+      </w:r>
+      <w:r>
+        <w:rPr>
+          <w:rFonts w:ascii="PeydaWeb" w:hAnsi="PeydaWeb" w:cs="PeydaWeb"/>
+        </w:rPr>
+        <w:t>):</w:t>
+      </w:r>
+    </w:p>
+    <w:p>
+      <w:pPr>
+        <w:bidi/>
+        <w:spacing w:after="120"/>
+        <w:rPr>
+          <w:rFonts w:ascii="PeydaWeb" w:hAnsi="PeydaWeb" w:cs="PeydaWeb"/>
+        </w:rPr>
+      </w:pPr>
+      <w:r>
+        <w:rPr>
+          <w:rFonts w:ascii="PeydaWeb" w:hAnsi="PeydaWeb" w:cs="PeydaWeb"/>
+          <w:rtl/>
+          <w:lang w:bidi="fa-IR"/>
+        </w:rPr>
+        <w:t>۱</w:t>
+      </w:r>
+      <w:r>
+        <w:rPr>
+          <w:rFonts w:ascii="PeydaWeb" w:hAnsi="PeydaWeb" w:cs="PeydaWeb"/>
+        </w:rPr>
+        <w:t xml:space="preserve">. </w:t>
+      </w:r>
+      <w:r>
+        <w:rPr>
+          <w:rFonts w:ascii="PeydaWeb" w:hAnsi="PeydaWeb" w:cs="PeydaWeb"/>
+          <w:rtl/>
+        </w:rPr>
+        <w:t>فایلی که باید کپی شود</w:t>
+      </w:r>
+      <w:r>
+        <w:rPr>
+          <w:rFonts w:ascii="PeydaWeb" w:hAnsi="PeydaWeb" w:cs="PeydaWeb"/>
+        </w:rPr>
+        <w:t xml:space="preserve">: </w:t>
+      </w:r>
+      <w:r>
+        <w:rPr>
+          <w:rFonts w:ascii="PeydaWeb" w:hAnsi="PeydaWeb" w:cs="PeydaWeb"/>
+          <w:rtl/>
+        </w:rPr>
+        <w:t>داخل پوشه نصب افزونه، این مسیر را پیدا کنید</w:t>
+      </w:r>
+      <w:r>
+        <w:rPr>
+          <w:rFonts w:ascii="PeydaWeb" w:hAnsi="PeydaWeb" w:cs="PeydaWeb"/>
+        </w:rPr>
+        <w:t>:</w:t>
+      </w:r>
+    </w:p>
+    <w:p>
+      <w:pPr>
+        <w:bidi/>
+        <w:spacing w:after="120"/>
+        <w:rPr>
+          <w:rFonts w:ascii="PeydaWeb" w:hAnsi="PeydaWeb" w:cs="PeydaWeb"/>
+        </w:rPr>
+      </w:pPr>
+      <w:r>
+        <w:rPr>
+          <w:rFonts w:ascii="PeydaWeb" w:hAnsi="PeydaWeb" w:cs="PeydaWeb"/>
+        </w:rPr>
+        <w:t>wp-content/plugins/</w:t>
+      </w:r>
+      <w:proofErr w:type="spellStart"/>
+      <w:r>
+        <w:rPr>
+          <w:rFonts w:ascii="PeydaWeb" w:hAnsi="PeydaWeb" w:cs="PeydaWeb"/>
+        </w:rPr>
+        <w:t>plugitify</w:t>
+      </w:r>
+      <w:proofErr w:type="spellEnd"/>
+      <w:r>
+        <w:rPr>
+          <w:rFonts w:ascii="PeydaWeb" w:hAnsi="PeydaWeb" w:cs="PeydaWeb"/>
+        </w:rPr>
+        <w:t>/</w:t>
+      </w:r>
+      <w:proofErr w:type="spellStart"/>
+      <w:r>
+        <w:rPr>
+          <w:rFonts w:ascii="PeydaWeb" w:hAnsi="PeydaWeb" w:cs="PeydaWeb"/>
+        </w:rPr>
+        <w:t>src</w:t>
+      </w:r>
+      <w:proofErr w:type="spellEnd"/>
+      <w:r>
+        <w:rPr>
+          <w:rFonts w:ascii="PeydaWeb" w:hAnsi="PeydaWeb" w:cs="PeydaWeb"/>
+        </w:rPr>
+        <w:t>/</w:t>
+      </w:r>
+      <w:proofErr w:type="spellStart"/>
+      <w:r>
+        <w:rPr>
+          <w:rFonts w:ascii="PeydaWeb" w:hAnsi="PeydaWeb" w:cs="PeydaWeb"/>
+        </w:rPr>
+        <w:t>muPlugin</w:t>
+      </w:r>
+      <w:proofErr w:type="spellEnd"/>
+      <w:r>
+        <w:rPr>
+          <w:rFonts w:ascii="PeydaWeb" w:hAnsi="PeydaWeb" w:cs="PeydaWeb"/>
+        </w:rPr>
+        <w:t>/main/</w:t>
+      </w:r>
+      <w:proofErr w:type="spellStart"/>
+      <w:r>
+        <w:rPr>
+          <w:rFonts w:ascii="PeydaWeb" w:hAnsi="PeydaWeb" w:cs="PeydaWeb"/>
+        </w:rPr>
+        <w:t>plugitify.php</w:t>
+      </w:r>
+      <w:proofErr w:type="spellEnd"/>
+    </w:p>
+    <w:p>
+      <w:pPr>
+        <w:bidi/>
+        <w:spacing w:after="120"/>
+        <w:rPr>
+          <w:rFonts w:ascii="PeydaWeb" w:hAnsi="PeydaWeb" w:cs="PeydaWeb"/>
+        </w:rPr>
+      </w:pPr>
+      <w:r>
+        <w:rPr>
+          <w:rFonts w:ascii="PeydaWeb" w:hAnsi="PeydaWeb" w:cs="PeydaWeb"/>
+        </w:rPr>
+        <w:t>(</w:t>
+      </w:r>
+      <w:r>
+        <w:rPr>
+          <w:rFonts w:ascii="PeydaWeb" w:hAnsi="PeydaWeb" w:cs="PeydaWeb"/>
+          <w:rtl/>
+        </w:rPr>
+        <w:t xml:space="preserve">به پوشه </w:t>
+      </w:r>
+      <w:r>
+        <w:rPr>
+          <w:rFonts w:ascii="PeydaWeb" w:hAnsi="PeydaWeb" w:cs="PeydaWeb"/>
+        </w:rPr>
+        <w:t>wp-content/plugins/</w:t>
+      </w:r>
+      <w:proofErr w:type="spellStart"/>
+      <w:r>
+        <w:rPr>
+          <w:rFonts w:ascii="PeydaWeb" w:hAnsi="PeydaWeb" w:cs="PeydaWeb"/>
+        </w:rPr>
+        <w:t>plugitify</w:t>
+      </w:r>
+      <w:proofErr w:type="spellEnd"/>
+      <w:r>
+        <w:rPr>
+          <w:rFonts w:ascii="PeydaWeb" w:hAnsi="PeydaWeb" w:cs="PeydaWeb"/>
+        </w:rPr>
+        <w:t xml:space="preserve">/ </w:t>
+      </w:r>
+      <w:r>
+        <w:rPr>
+          <w:rFonts w:ascii="PeydaWeb" w:hAnsi="PeydaWeb" w:cs="PeydaWeb"/>
+          <w:rtl/>
+        </w:rPr>
+        <w:t xml:space="preserve">بروید، داخل آن </w:t>
+      </w:r>
+      <w:proofErr w:type="spellStart"/>
+      <w:r>
+        <w:rPr>
+          <w:rFonts w:ascii="PeydaWeb" w:hAnsi="PeydaWeb" w:cs="PeydaWeb"/>
+        </w:rPr>
+        <w:t>src</w:t>
+      </w:r>
+      <w:proofErr w:type="spellEnd"/>
+      <w:r>
+        <w:rPr>
+          <w:rFonts w:ascii="PeydaWeb" w:hAnsi="PeydaWeb" w:cs="PeydaWeb"/>
+        </w:rPr>
+        <w:t>/</w:t>
+      </w:r>
+      <w:proofErr w:type="spellStart"/>
+      <w:r>
+        <w:rPr>
+          <w:rFonts w:ascii="PeydaWeb" w:hAnsi="PeydaWeb" w:cs="PeydaWeb"/>
+        </w:rPr>
+        <w:t>muPlugin</w:t>
+      </w:r>
+      <w:proofErr w:type="spellEnd"/>
+      <w:r>
+        <w:rPr>
+          <w:rFonts w:ascii="PeydaWeb" w:hAnsi="PeydaWeb" w:cs="PeydaWeb"/>
+        </w:rPr>
+        <w:t xml:space="preserve">/main/ </w:t>
+      </w:r>
+      <w:r>
+        <w:rPr>
+          <w:rFonts w:ascii="PeydaWeb" w:hAnsi="PeydaWeb" w:cs="PeydaWeb"/>
+          <w:rtl/>
+        </w:rPr>
+        <w:t xml:space="preserve">را باز کنید؛ فایل </w:t>
+      </w:r>
+      <w:proofErr w:type="spellStart"/>
+      <w:r>
+        <w:rPr>
+          <w:rFonts w:ascii="PeydaWeb" w:hAnsi="PeydaWeb" w:cs="PeydaWeb"/>
+        </w:rPr>
+        <w:t>plugitify.php</w:t>
+      </w:r>
+      <w:proofErr w:type="spellEnd"/>
+      <w:r>
+        <w:rPr>
+          <w:rFonts w:ascii="PeydaWeb" w:hAnsi="PeydaWeb" w:cs="PeydaWeb"/>
+        </w:rPr>
+        <w:t xml:space="preserve"> </w:t>
+      </w:r>
+      <w:r>
+        <w:rPr>
+          <w:rFonts w:ascii="PeydaWeb" w:hAnsi="PeydaWeb" w:cs="PeydaWeb"/>
+          <w:rtl/>
+        </w:rPr>
+        <w:t>همان‌جاست</w:t>
+      </w:r>
+      <w:r>
+        <w:rPr>
+          <w:rFonts w:ascii="PeydaWeb" w:hAnsi="PeydaWeb" w:cs="PeydaWeb"/>
+        </w:rPr>
+        <w:t>.)</w:t>
+      </w:r>
+    </w:p>
+    <w:p>
+      <w:pPr>
+        <w:bidi/>
+        <w:spacing w:after="120"/>
+        <w:rPr>
+          <w:rFonts w:ascii="PeydaWeb" w:hAnsi="PeydaWeb" w:cs="PeydaWeb"/>
+        </w:rPr>
+      </w:pPr>
+      <w:r>
+        <w:rPr>
+          <w:rFonts w:ascii="PeydaWeb" w:hAnsi="PeydaWeb" w:cs="PeydaWeb"/>
+          <w:rtl/>
+          <w:lang w:bidi="fa-IR"/>
+        </w:rPr>
+        <w:t>۲</w:t>
+      </w:r>
+      <w:r>
+        <w:rPr>
+          <w:rFonts w:ascii="PeydaWeb" w:hAnsi="PeydaWeb" w:cs="PeydaWeb"/>
+        </w:rPr>
+        <w:t xml:space="preserve">. </w:t>
+      </w:r>
+      <w:r>
+        <w:rPr>
+          <w:rFonts w:ascii="PeydaWeb" w:hAnsi="PeydaWeb" w:cs="PeydaWeb"/>
+          <w:rtl/>
+        </w:rPr>
+        <w:t>کجا پیست شود</w:t>
+      </w:r>
+      <w:r>
+        <w:rPr>
+          <w:rFonts w:ascii="PeydaWeb" w:hAnsi="PeydaWeb" w:cs="PeydaWeb"/>
+        </w:rPr>
+        <w:t xml:space="preserve">: </w:t>
+      </w:r>
+      <w:r>
+        <w:rPr>
+          <w:rFonts w:ascii="PeydaWeb" w:hAnsi="PeydaWeb" w:cs="PeydaWeb"/>
+          <w:rtl/>
+        </w:rPr>
+        <w:t>این فایل را در پوشه زیر کپی کنید</w:t>
+      </w:r>
+      <w:r>
+        <w:rPr>
+          <w:rFonts w:ascii="PeydaWeb" w:hAnsi="PeydaWeb" w:cs="PeydaWeb"/>
+        </w:rPr>
+        <w:t>:</w:t>
+      </w:r>
+    </w:p>
+    <w:p>
+      <w:pPr>
+        <w:bidi/>
+        <w:spacing w:after="120"/>
+        <w:rPr>
+          <w:rFonts w:ascii="PeydaWeb" w:hAnsi="PeydaWeb" w:cs="PeydaWeb"/>
+        </w:rPr>
+      </w:pPr>
+      <w:r>
+        <w:rPr>
+          <w:rFonts w:ascii="PeydaWeb" w:hAnsi="PeydaWeb" w:cs="PeydaWeb"/>
+        </w:rPr>
+        <w:t>wp-content/mu-plugins/</w:t>
+      </w:r>
+    </w:p>
+    <w:p>
+      <w:pPr>
+        <w:bidi/>
+        <w:spacing w:after="120"/>
+        <w:rPr>
+          <w:rFonts w:ascii="PeydaWeb" w:hAnsi="PeydaWeb" w:cs="PeydaWeb"/>
+        </w:rPr>
+      </w:pPr>
+      <w:r>
+        <w:rPr>
+          <w:rFonts w:ascii="PeydaWeb" w:hAnsi="PeydaWeb" w:cs="PeydaWeb"/>
+          <w:rtl/>
+        </w:rPr>
+        <w:t xml:space="preserve">اگر این پوشه وجود ندارد، خودتان آن را داخل </w:t>
+      </w:r>
+      <w:r>
+        <w:rPr>
+          <w:rFonts w:ascii="PeydaWeb" w:hAnsi="PeydaWeb" w:cs="PeydaWeb"/>
+        </w:rPr>
+        <w:t xml:space="preserve">wp-content </w:t>
+      </w:r>
+      <w:r>
+        <w:rPr>
+          <w:rFonts w:ascii="PeydaWeb" w:hAnsi="PeydaWeb" w:cs="PeydaWeb"/>
+          <w:rtl/>
+        </w:rPr>
+        <w:t xml:space="preserve">بسازید (کنار پوشه‌های </w:t>
+      </w:r>
+      <w:r>
+        <w:rPr>
+          <w:rFonts w:ascii="PeydaWeb" w:hAnsi="PeydaWeb" w:cs="PeydaWeb"/>
+        </w:rPr>
+        <w:t xml:space="preserve">plugins </w:t>
+      </w:r>
+      <w:r>
+        <w:rPr>
+          <w:rFonts w:ascii="PeydaWeb" w:hAnsi="PeydaWeb" w:cs="PeydaWeb"/>
+          <w:rtl/>
+        </w:rPr>
+        <w:t xml:space="preserve">و </w:t>
+      </w:r>
+      <w:r>
+        <w:rPr>
+          <w:rFonts w:ascii="PeydaWeb" w:hAnsi="PeydaWeb" w:cs="PeydaWeb"/>
+        </w:rPr>
+        <w:t>themes).</w:t>
+      </w:r>
+    </w:p>
+    <w:p>
+      <w:pPr>
+        <w:bidi/>
+        <w:spacing w:after="120"/>
+        <w:rPr>
+          <w:rFonts w:ascii="PeydaWeb" w:hAnsi="PeydaWeb" w:cs="PeydaWeb"/>
+        </w:rPr>
+      </w:pPr>
+      <w:r>
+        <w:rPr>
+          <w:rFonts w:ascii="PeydaWeb" w:hAnsi="PeydaWeb" w:cs="PeydaWeb"/>
+          <w:rtl/>
+          <w:lang w:bidi="fa-IR"/>
+        </w:rPr>
+        <w:lastRenderedPageBreak/>
+        <w:t>۳</w:t>
+      </w:r>
+      <w:r>
+        <w:rPr>
+          <w:rFonts w:ascii="PeydaWeb" w:hAnsi="PeydaWeb" w:cs="PeydaWeb"/>
+        </w:rPr>
+        <w:t xml:space="preserve">. </w:t>
+      </w:r>
+      <w:r>
+        <w:rPr>
+          <w:rFonts w:ascii="PeydaWeb" w:hAnsi="PeydaWeb" w:cs="PeydaWeb"/>
+          <w:rtl/>
+        </w:rPr>
+        <w:t xml:space="preserve">نام فایل را عوض نکنید </w:t>
+      </w:r>
+      <w:r>
+        <w:rPr>
+          <w:rFonts w:ascii="PeydaWeb" w:hAnsi="PeydaWeb" w:cs="PeydaWeb"/>
+        </w:rPr>
+        <w:t xml:space="preserve">— </w:t>
+      </w:r>
+      <w:r>
+        <w:rPr>
+          <w:rFonts w:ascii="PeydaWeb" w:hAnsi="PeydaWeb" w:cs="PeydaWeb"/>
+          <w:rtl/>
+        </w:rPr>
+        <w:t xml:space="preserve">باید دقیقاً </w:t>
+      </w:r>
+      <w:proofErr w:type="spellStart"/>
+      <w:r>
+        <w:rPr>
+          <w:rFonts w:ascii="PeydaWeb" w:hAnsi="PeydaWeb" w:cs="PeydaWeb"/>
+        </w:rPr>
+        <w:t>plugitify.php</w:t>
+      </w:r>
+      <w:proofErr w:type="spellEnd"/>
+      <w:r>
+        <w:rPr>
+          <w:rFonts w:ascii="PeydaWeb" w:hAnsi="PeydaWeb" w:cs="PeydaWeb"/>
+        </w:rPr>
+        <w:t xml:space="preserve"> </w:t>
+      </w:r>
+      <w:r>
+        <w:rPr>
+          <w:rFonts w:ascii="PeydaWeb" w:hAnsi="PeydaWeb" w:cs="PeydaWeb"/>
+          <w:rtl/>
+        </w:rPr>
+        <w:t>بماند. آدرس نهایی فایل باید این باشد</w:t>
+      </w:r>
+      <w:r>
+        <w:rPr>
+          <w:rFonts w:ascii="PeydaWeb" w:hAnsi="PeydaWeb" w:cs="PeydaWeb"/>
+        </w:rPr>
+        <w:t>:</w:t>
+      </w:r>
+    </w:p>
+    <w:p>
+      <w:pPr>
+        <w:bidi/>
+        <w:spacing w:after="120"/>
+        <w:rPr>
+          <w:rFonts w:ascii="PeydaWeb" w:hAnsi="PeydaWeb" w:cs="PeydaWeb"/>
+        </w:rPr>
+      </w:pPr>
+      <w:r>
+        <w:rPr>
+          <w:rFonts w:ascii="PeydaWeb" w:hAnsi="PeydaWeb" w:cs="PeydaWeb"/>
+        </w:rPr>
+        <w:t>wp-content/mu-plugins/</w:t>
+      </w:r>
+      <w:proofErr w:type="spellStart"/>
+      <w:r>
+        <w:rPr>
+          <w:rFonts w:ascii="PeydaWeb" w:hAnsi="PeydaWeb" w:cs="PeydaWeb"/>
+        </w:rPr>
+        <w:t>plugitify.php</w:t>
+      </w:r>
+      <w:proofErr w:type="spellEnd"/>
+    </w:p>
+    <w:p>
+      <w:pPr>
+        <w:bidi/>
+        <w:spacing w:after="120"/>
+        <w:rPr>
+          <w:rFonts w:ascii="PeydaWeb" w:hAnsi="PeydaWeb" w:cs="PeydaWeb"/>
+        </w:rPr>
+      </w:pPr>
+      <w:r>
+        <w:rPr>
+          <w:rFonts w:ascii="PeydaWeb" w:hAnsi="PeydaWeb" w:cs="PeydaWeb"/>
+          <w:rtl/>
+          <w:lang w:bidi="fa-IR"/>
+        </w:rPr>
+        <w:t>۴</w:t>
+      </w:r>
+      <w:r>
+        <w:rPr>
+          <w:rFonts w:ascii="PeydaWeb" w:hAnsi="PeydaWeb" w:cs="PeydaWeb"/>
+        </w:rPr>
+        <w:t xml:space="preserve">. </w:t>
+      </w:r>
+      <w:r>
+        <w:rPr>
+          <w:rFonts w:ascii="PeydaWeb" w:hAnsi="PeydaWeb" w:cs="PeydaWeb"/>
+          <w:rtl/>
+        </w:rPr>
+        <w:t>بعد از کپی، صفحه پیشخوان را یک‌بار تازه‌سازی کنید؛ پیام قرمز باید ناپدید شود و استودیو باز شود</w:t>
+      </w:r>
+      <w:r>
+        <w:rPr>
+          <w:rFonts w:ascii="PeydaWeb" w:hAnsi="PeydaWeb" w:cs="PeydaWeb"/>
+        </w:rPr>
+        <w:t>.</w:t>
+      </w:r>
+    </w:p>
+    <w:p>
+      <w:pPr>
+        <w:bidi/>
+        <w:spacing w:after="120"/>
+        <w:rPr>
+          <w:rFonts w:ascii="PeydaWeb" w:hAnsi="PeydaWeb" w:cs="PeydaWeb"/>
+        </w:rPr>
+      </w:pPr>
+      <w:r>
+        <w:rPr>
+          <w:rFonts w:ascii="PeydaWeb" w:hAnsi="PeydaWeb" w:cs="PeydaWeb"/>
+          <w:rtl/>
+        </w:rPr>
+        <w:t xml:space="preserve">نکته: اگر بعد از آپدیت افزونه همین پیام (با عنوان «فایل بارگذار به‌روز نیست») دوباره ظاهر شد، یعنی باید همان فایل را دوباره از مسیر مبدأ کپی کنید و نسخه قدیمی داخل </w:t>
+      </w:r>
+      <w:r>
+        <w:rPr>
+          <w:rFonts w:ascii="PeydaWeb" w:hAnsi="PeydaWeb" w:cs="PeydaWeb"/>
+        </w:rPr>
+        <w:t xml:space="preserve">mu-plugins </w:t>
+      </w:r>
+      <w:r>
+        <w:rPr>
+          <w:rFonts w:ascii="PeydaWeb" w:hAnsi="PeydaWeb" w:cs="PeydaWeb"/>
+          <w:rtl/>
+        </w:rPr>
+        <w:t>را با آن جایگزین (بازنویسی) کنید</w:t>
+      </w:r>
+      <w:r>
+        <w:rPr>
+          <w:rFonts w:ascii="PeydaWeb" w:hAnsi="PeydaWeb" w:cs="PeydaWeb"/>
+        </w:rPr>
+        <w:t>.</w:t>
+      </w:r>
+    </w:p>
+    <w:p>
+      <w:pPr>
+        <w:bidi/>
+        <w:spacing w:after="120"/>
+        <w:rPr>
+          <w:rFonts w:ascii="PeydaWeb" w:hAnsi="PeydaWeb" w:cs="PeydaWeb"/>
+        </w:rPr>
+      </w:pPr>
+      <w:r>
+        <w:rPr>
+          <w:rFonts w:ascii="PeydaWeb" w:hAnsi="PeydaWeb" w:cs="PeydaWeb"/>
+          <w:rtl/>
+        </w:rPr>
+        <w:t>اگر به فایل‌های سرور دسترسی مستقیم ندارید، همین دو مسیر (مبدأ و مقصد) را برای پشتیبانی هاست بفرستید تا خودشان فایل را جای‌گذاری کنند</w:t>
+      </w:r>
+      <w:r>
+        <w:rPr>
+          <w:rFonts w:ascii="PeydaWeb" w:hAnsi="PeydaWeb" w:cs="PeydaWeb"/>
+        </w:rPr>
+        <w:t>.</w:t>
+      </w:r>
+    </w:p>
+    <w:p>
+      <w:pPr>
+        <w:bidi/>
+        <w:spacing w:after="120"/>
+        <w:rPr>
+          <w:rFonts w:ascii="PeydaWeb" w:hAnsi="PeydaWeb" w:cs="PeydaWeb"/>
+        </w:rPr>
+      </w:pPr>
+    </w:p>
+    <w:p>
+      <w:pPr>
+        <w:bidi/>
+        <w:spacing w:after="200"/>
+        <w:rPr>
+          <w:rFonts w:ascii="PeydaWeb" w:hAnsi="PeydaWeb" w:cs="PeydaWeb"/>
+        </w:rPr>
+      </w:pPr>
+      <w:r>
+        <w:rPr>
+          <w:rFonts w:ascii="PeydaWeb" w:hAnsi="PeydaWeb" w:cs="PeydaWeb"/>
+        </w:rPr>
+        <w:t xml:space="preserve"> </w:t>
+      </w:r>
+    </w:p>
+    <w:p>
+      <w:pPr>
+        <w:bidi/>
+        <w:spacing w:after="120"/>
+        <w:rPr>
+          <w:rFonts w:ascii="PeydaWeb" w:hAnsi="PeydaWeb" w:cs="PeydaWeb"/>
+        </w:rPr>
+      </w:pPr>
+      <w:r>
+        <w:rPr>
+          <w:rFonts w:ascii="PeydaWeb" w:hAnsi="PeydaWeb" w:cs="PeydaWeb"/>
+          <w:b/>
+          <w:bCs/>
+          <w:rtl/>
+        </w:rPr>
+        <w:t>پیام «دسترسی مدیر لازم است» می‌گیرم.</w:t>
       </w:r>
       <w:r>
         <w:rPr>
@@ -2380,35 +3140,7 @@
           <w:rFonts w:ascii="PeydaWeb" w:hAnsi="PeydaWeb" w:cs="PeydaWeb"/>
           <w:rtl/>
         </w:rPr>
-        <w:t xml:space="preserve">افزونه هنگام فعال شدن، یک فایل بارگذار را خودکار در </w:t>
-      </w:r>
-      <w:r>
-        <w:rPr>
-          <w:rFonts w:ascii="PeydaWeb" w:eastAsia="Courier New" w:hAnsi="PeydaWeb" w:cs="PeydaWeb"/>
-          <w:shd w:val="clear" w:color="auto" w:fill="F1F5F9"/>
-        </w:rPr>
-        <w:t>wp-content/mu-plugins/</w:t>
-      </w:r>
-      <w:r>
-        <w:rPr>
-          <w:rFonts w:ascii="PeydaWeb" w:hAnsi="PeydaWeb" w:cs="PeydaWeb"/>
-          <w:rtl/>
-        </w:rPr>
-        <w:t xml:space="preserve"> می‌سازد. اگر هاست اجازه نوشتن نداده باشد، در بالای پیشخوان پیام قرمز می‌بینید. در این حالت دسترسی نوشتن پوشه </w:t>
-      </w:r>
-      <w:r>
-        <w:rPr>
-          <w:rFonts w:ascii="PeydaWeb" w:eastAsia="Courier New" w:hAnsi="PeydaWeb" w:cs="PeydaWeb"/>
-          <w:shd w:val="clear" w:color="auto" w:fill="F1F5F9"/>
-        </w:rPr>
-        <w:t>wp-content</w:t>
-      </w:r>
-      <w:r>
-        <w:rPr>
-          <w:rFonts w:ascii="PeydaWeb" w:hAnsi="PeydaWeb" w:cs="PeydaWeb"/>
-          <w:rtl/>
-        </w:rPr>
-        <w:t xml:space="preserve"> را (۷۵۵ یا ۷۷۵) درست کنید و یک‌بار صفحه پیشخوان را تازه کنید؛ فایل خودبه‌خود ساخته می‌شود. در صورت ادامه مشکل با پشتیبانی هاست تماس بگیرید.</w:t>
+        <w:t>با حسابی وارد شده‌اید که مدیر کل نیست. با حساب مدیر وارد شوید.</w:t>
       </w:r>
     </w:p>
     <w:p>
@@ -2441,7 +3173,7 @@
           <w:bCs/>
           <w:rtl/>
         </w:rPr>
-        <w:t>پیام «دسترسی مدیر لازم است» می‌گیرم.</w:t>
+        <w:t>هوش مصنوعی جواب نمی‌دهد یا خطای کلید می‌دهد.</w:t>
       </w:r>
       <w:r>
         <w:rPr>
@@ -2454,7 +3186,7 @@
           <w:rFonts w:ascii="PeydaWeb" w:hAnsi="PeydaWeb" w:cs="PeydaWeb"/>
           <w:rtl/>
         </w:rPr>
-        <w:t>با حسابی وارد شده‌اید که مدیر کل نیست. با حساب مدیر وارد شوید.</w:t>
+        <w:t>کلید API را در تنظیمات دوباره بررسی کنید؛ ممکن است اشتباه کپی شده، منقضی شده یا اعتبار حسابتان تمام شده باشد.</w:t>
       </w:r>
     </w:p>
     <w:p>
@@ -2487,7 +3219,7 @@
           <w:bCs/>
           <w:rtl/>
         </w:rPr>
-        <w:t>هوش مصنوعی جواب نمی‌دهد یا خطای کلید می‌دهد.</w:t>
+        <w:t>پیام «ارتباط با اندپوینت مدل برقرار نشد» می‌بینم.</w:t>
       </w:r>
       <w:r>
         <w:rPr>
@@ -2500,52 +3232,6 @@
           <w:rFonts w:ascii="PeydaWeb" w:hAnsi="PeydaWeb" w:cs="PeydaWeb"/>
           <w:rtl/>
         </w:rPr>
-        <w:t>کلید API را در تنظیمات دوباره بررسی کنید؛ ممکن است اشتباه کپی شده، منقضی شده یا اعتبار حسابتان تمام شده باشد.</w:t>
-      </w:r>
-    </w:p>
-    <w:p>
-      <w:pPr>
-        <w:bidi/>
-        <w:spacing w:after="200"/>
-        <w:rPr>
-          <w:rFonts w:ascii="PeydaWeb" w:hAnsi="PeydaWeb" w:cs="PeydaWeb"/>
-        </w:rPr>
-      </w:pPr>
-      <w:r>
-        <w:rPr>
-          <w:rFonts w:ascii="PeydaWeb" w:hAnsi="PeydaWeb" w:cs="PeydaWeb"/>
-        </w:rPr>
-        <w:t xml:space="preserve"> </w:t>
-      </w:r>
-    </w:p>
-    <w:p>
-      <w:pPr>
-        <w:bidi/>
-        <w:spacing w:after="120"/>
-        <w:rPr>
-          <w:rFonts w:ascii="PeydaWeb" w:hAnsi="PeydaWeb" w:cs="PeydaWeb"/>
-        </w:rPr>
-      </w:pPr>
-      <w:r>
-        <w:rPr>
-          <w:rFonts w:ascii="PeydaWeb" w:hAnsi="PeydaWeb" w:cs="PeydaWeb"/>
-          <w:b/>
-          <w:bCs/>
-          <w:rtl/>
-        </w:rPr>
-        <w:t>پیام «ارتباط با اندپوینت مدل برقرار نشد» می‌بینم.</w:t>
-      </w:r>
-      <w:r>
-        <w:rPr>
-          <w:rFonts w:ascii="PeydaWeb" w:hAnsi="PeydaWeb" w:cs="PeydaWeb"/>
-        </w:rPr>
-        <w:br/>
-      </w:r>
-      <w:r>
-        <w:rPr>
-          <w:rFonts w:ascii="PeydaWeb" w:hAnsi="PeydaWeb" w:cs="PeydaWeb"/>
-          <w:rtl/>
-        </w:rPr>
         <w:t xml:space="preserve">اینترنت </w:t>
       </w:r>
       <w:r>
@@ -2562,15 +3248,7 @@
           <w:rFonts w:ascii="PeydaWeb" w:hAnsi="PeydaWeb" w:cs="PeydaWeb"/>
           <w:rtl/>
         </w:rPr>
-        <w:t xml:space="preserve"> به آن سرویس‌دهنده نمی‌رسد. تحریم‌شکن را روی سیستم خود روشن کنید </w:t>
-      </w:r>
-      <w:r>
-        <w:rPr>
-          <w:rFonts w:ascii="PeydaWeb" w:hAnsi="PeydaWeb" w:cs="PeydaWeb"/>
-          <w:rtl/>
-        </w:rPr>
-        <w:lastRenderedPageBreak/>
-        <w:t>و دوباره امتحان کنید؛ اگر باز هم تکرار شد، سرویس‌دهنده‌ای انتخاب کنید که ارتباط از مرورگر (CORS) را اجازه می‌دهد — مثل OpenRouter، GapGPT یا AvalAI.</w:t>
+        <w:t xml:space="preserve"> به آن سرویس‌دهنده نمی‌رسد. تحریم‌شکن را روی سیستم خود روشن کنید و دوباره امتحان کنید؛ اگر باز هم تکرار شد، سرویس‌دهنده‌ای انتخاب کنید که ارتباط از مرورگر (CORS) را اجازه می‌دهد — مثل OpenRouter، GapGPT یا AvalAI.</w:t>
       </w:r>
     </w:p>
     <w:p>
@@ -2783,6 +3461,7 @@
           <w:rFonts w:ascii="PeydaWeb" w:hAnsi="PeydaWeb" w:cs="PeydaWeb"/>
           <w:rtl/>
         </w:rPr>
+        <w:lastRenderedPageBreak/>
         <w:t xml:space="preserve">پیش از تغییرات مهم، از سایت خود </w:t>
       </w:r>
       <w:r>
@@ -2878,28 +3557,7 @@
           <w:rFonts w:ascii="PeydaWeb" w:hAnsi="PeydaWeb" w:cs="PeydaWeb"/>
           <w:rtl/>
         </w:rPr>
-        <w:t xml:space="preserve">جهت ارتباط با </w:t>
-      </w:r>
-      <w:r>
-        <w:rPr>
-          <w:rFonts w:ascii="PeydaWeb" w:hAnsi="PeydaWeb" w:cs="PeydaWeb"/>
-          <w:rtl/>
-        </w:rPr>
-        <w:t>پشتیبانی</w:t>
-      </w:r>
-      <w:r>
-        <w:rPr>
-          <w:rFonts w:ascii="PeydaWeb" w:hAnsi="PeydaWeb" w:cs="PeydaWeb"/>
-          <w:rtl/>
-        </w:rPr>
-        <w:t xml:space="preserve"> </w:t>
-      </w:r>
-      <w:r>
-        <w:rPr>
-          <w:rFonts w:ascii="PeydaWeb" w:hAnsi="PeydaWeb" w:cs="PeydaWeb"/>
-          <w:rtl/>
-        </w:rPr>
-        <w:t xml:space="preserve"> از طریق صفحه محصول در </w:t>
+        <w:t xml:space="preserve">جهت ارتباط با پشتیبانی  از طریق صفحه محصول در </w:t>
       </w:r>
       <w:r>
         <w:rPr>
@@ -3620,7 +4278,6 @@
   <w:style w:type="character" w:default="1" w:styleId="DefaultParagraphFont">
     <w:name w:val="Default Paragraph Font"/>
     <w:uiPriority w:val="1"/>
-    <w:semiHidden/>
     <w:unhideWhenUsed/>
   </w:style>
   <w:style w:type="table" w:default="1" w:styleId="TableNormal">
@@ -3704,6 +4361,14 @@
       <w:sz w:val="20"/>
       <w:szCs w:val="20"/>
     </w:rPr>
+  </w:style>
+  <w:style w:type="paragraph" w:styleId="NormalWeb">
+    <w:name w:val="Normal (Web)"/>
+    <w:basedOn w:val="Normal"/>
+    <w:uiPriority w:val="99"/>
+    <w:semiHidden/>
+    <w:unhideWhenUsed/>
+    <w:rsid w:val="00A97E33"/>
   </w:style>
 </w:styles>
 </file>

</xml_diff>